<commit_message>
Synchronize revised manuscript DOCX
</commit_message>
<xml_diff>
--- a/paper/thesis.docx
+++ b/paper/thesis.docx
@@ -137,7 +137,7 @@
         <w:rPr>
           <w:i w:val="0"/>
         </w:rPr>
-        <w:t>Several complementary designs support the same conclusion. An international difference-in-differences comparison yields an effect of -13.09 percentage points, and excluding national holidays changes the estimate only modestly to -13.38 percentage points. Outcome-specific synthetic controls show declines of 86.2 percent in productive activity, 92.2 percent in shipping activity, and 92.1 percent in collaborative activity. A regression discontinuity in time centered on July 18 produces a smaller but still large discontinuity of roughly -9 percentage points in the daily activity rate. Event-study estimates show a sharp break around the shutdown rather than a smooth continuation of pre-treatment movements.</w:t>
+        <w:t>Several complementary designs support the same conclusion. An international difference-in-differences comparison yields an effect of -13.09 percentage points, and excluding national holidays changes the estimate only modestly to -13.38 percentage points. Outcome-specific synthetic controls show declines of 86.2 percent in productive activity, 92.2 percent in shipping activity, and 92.1 percent in collaborative activity. A regression discontinuity in time at the July 17 cutoff produces a smaller but still large discontinuity of roughly -9 percentage points in the daily activity rate. Event-study estimates show a sharp break around the shutdown rather than a smooth continuation of pre-treatment movements.</w:t>
       </w:r>
     </w:p>
     <w:p>
@@ -148,7 +148,7 @@
         <w:rPr>
           <w:i w:val="0"/>
         </w:rPr>
-        <w:t>The paper's second contribution is to distinguish observable online activity from underlying code creation. A Git commit can be created locally without Internet access, while the corresponding push to GitHub requires connectivity. For a large sample of public commits, I recover Git author and committer timestamps and match them to the first observed public PushEvent. In the strict sample where the commit author is the same GitHub account that performs the push, 829 of 2,932 commits authored during the July 18-23 shutdown, or 28.3 percent, are first observed in a public push on or after July 24. Using the committer timestamp yields 27.2 percent. The share of shutdown-authored commits delayed by more than 24 hours is 29.7 percent, compared with 1.1 percent on average in comparable six-day placebo windows before the shutdown. These patterns are consistent with local code production continuing for some developers while publication and synchronization were deferred until connectivity returned.</w:t>
+        <w:t>The paper's second contribution is to distinguish observable online activity from underlying code creation. A Git commit can be created locally without Internet access, while the corresponding push to GitHub requires connectivity. For a large sample of public commits, I recover Git author and committer timestamps and match them to the first observed public PushEvent. In the strict sample where the commit author is the same GitHub account that performs the push, 829 of 2,932 commits authored during the July 18-23 shutdown, or 28.3 percent, are first observed in a public push on or after July 24. Using the committer timestamp yields 27.2 percent. The share of shutdown-authored commits delayed by more than 24 hours is 29.7 percent, compared with an average of 1.1 percent across six comparable pre-shutdown placebo windows of six days each. These patterns are consistent with local code production continuing for some developers while publication and synchronization were deferred until connectivity returned.</w:t>
       </w:r>
     </w:p>
     <w:p>
@@ -170,7 +170,7 @@
         <w:rPr>
           <w:i w:val="0"/>
         </w:rPr>
-        <w:t>The interpretation is deliberately narrower than 'total software productivity.' Public GitHub events omit private repositories, other hosting services, meetings, local coding that is never pushed publicly, and non-coding work. User location is self-reported rather than physically verified. Most importantly, the shutdown was implemented amid severe domestic unrest, so the design cannot mechanically separate every contemporaneous Bangladesh-specific shock from the connectivity shock. The paper therefore estimates a large collapse in observable GitHub software-production activity during the shutdown episode, and then uses the commit-timestamp mechanism to show that delayed connectivity itself accounts for a meaningful part of the observed collapse.</w:t>
+        <w:t>The interpretation is deliberately narrower than 'total software productivity.' Public GitHub events omit private repositories, other hosting services, meetings, local coding that is never pushed publicly, and non-coding work. User location is self-reported rather than physically verified. Most importantly, the shutdown was implemented amid severe domestic unrest, so the design cannot mechanically separate every contemporaneous Bangladesh-specific shock from the connectivity shock. The paper therefore estimates a large collapse in observable GitHub software-production activity during the shutdown episode, and then uses the commit-timestamp mechanism to examine whether delayed connectivity is consistent with accounting for part of the observed collapse.</w:t>
       </w:r>
     </w:p>
     <w:p>
@@ -199,7 +199,7 @@
         <w:rPr>
           <w:i w:val="0"/>
         </w:rPr>
-        <w:t>The shutdown followed escalating student protests over public-sector hiring quotas. The political context matters for identification because the decision to restrict connectivity was not randomly assigned. The empirical design therefore relies on the timing and severity of the network disruption, together with cross-country and within-Bangladesh comparisons, rather than assuming that the broader domestic environment was unchanged.</w:t>
+        <w:t>The shutdown followed escalating student protests over public-sector hiring quotas. [CITATION NEEDS VERIFICATION] The political context matters for identification because the decision to restrict connectivity was not randomly assigned. The empirical design therefore relies on the timing and severity of the network disruption, together with cross-country and within-Bangladesh comparisons, rather than assuming that the broader domestic environment was unchanged.</w:t>
       </w:r>
     </w:p>
     <w:p>
@@ -714,7 +714,7 @@
         <w:keepNext/>
       </w:pPr>
       <w:r>
-        <w:t>2.2 Why software production is informative</w:t>
+        <w:t>2.2 Why GitHub activity is informative about software production</w:t>
       </w:r>
     </w:p>
     <w:p>
@@ -1642,7 +1642,7 @@
         <w:rPr>
           <w:i w:val="0"/>
         </w:rPr>
-        <w:t>A regression discontinuity in time centered on July 18 provides a third temporal comparison. I estimate local linear models on daily Bangladesh activity and on a Bangladesh-minus-control residualized series, with heteroskedasticity-and-autocorrelation-consistent standard errors. Following Hausman and Rapson (2018), I vary bandwidths and polynomial order, report donut specifications that omit dates immediately adjacent to the cutoff, inspect autocorrelation, and use placebo cutoffs. Because time itself is the running variable and other contemporaneous events can occur at the same date, the RDiT is interpreted as a robustness check rather than a standalone source of causal identification.</w:t>
+        <w:t>A regression discontinuity in time at the July 17 cutoff provides a third temporal comparison. I estimate local linear models on daily Bangladesh activity and on a Bangladesh-minus-control residualized series, with heteroskedasticity-and-autocorrelation-consistent standard errors. Following Hausman and Rapson (2018), I vary bandwidths and polynomial order, report donut specifications that omit dates immediately adjacent to the cutoff, inspect autocorrelation, and use placebo cutoffs. Because time itself is the running variable and other contemporaneous events can occur at the same date, the RDiT is interpreted as a robustness check rather than a standalone source of causal identification.</w:t>
       </w:r>
     </w:p>
     <w:p>
@@ -1724,7 +1724,7 @@
         <w:rPr>
           <w:i w:val="0"/>
         </w:rPr>
-        <w:t>The leave-one-out exercise is highly stable. Across specifications that remove one donor at a time, the ATT ranges only from -13.256 to -12.886 percentage points. In particular, excluding Pakistan produces -12.905 percentage points and excluding Kenya produces -12.886 percentage points. This matters because both countries experienced localized connectivity disruptions near the broader pre-treatment period: Internet Society reports regional restrictions in Pakistan around July 14-17, while Cloudflare documents a major Kenyan traffic disruption on June 25 (Internet Society, 2024; Cloudflare, 2024). The limited movement in the treatment estimate when either donor is removed reduces, though does not eliminate, concern that these donor-specific episodes drive the result.</w:t>
+        <w:t>The leave-one-out exercise is highly stable. Across specifications that remove one donor at a time, the ATT ranges only from -13.256 to -12.886 percentage points. In particular, excluding Pakistan produces -12.905 percentage points, excluding Ghana produces -13.209 percentage points, and excluding Kenya produces -12.886 percentage points. This matters because both countries experienced localized connectivity disruptions near the broader pre-treatment period: Internet Society reports regional restrictions in Pakistan around July 14-17, while Cloudflare documents a major Kenyan traffic disruption on June 25 (Internet Society, 2024; Cloudflare, 2024). The limited movement in the treatment estimate when either donor is removed reduces, though does not eliminate, concern that these donor-specific episodes drive the result.</w:t>
       </w:r>
     </w:p>
     <w:p>
@@ -2534,7 +2534,7 @@
         <w:rPr>
           <w:i w:val="0"/>
         </w:rPr>
-        <w:t>The RDiT produces a smaller point estimate but the same qualitative conclusion. A local linear specification around July 18 estimates a discontinuity of -9.28 percentage points in Bangladesh's active-user rate; a controlled Bangladesh-minus-Philippines version yields -9.16 percentage points. HAC p-values are approximately 0.065 in both cases, while a Philippines geographic placebo is near zero. Donut specifications that omit the dates adjacent to the cutoff produce larger negative discontinuities, although their magnitude is sensitive to the exact omitted window. Consistent with Hausman and Rapson (2018), I therefore emphasize the direction and timing of the break rather than treating the RDiT p-value as the decisive inferential statistic.</w:t>
+        <w:t>The RDiT produces a smaller point estimate but the same qualitative conclusion. A local linear specification at the July 17 cutoff estimates a discontinuity of -9.28 percentage points in Bangladesh's active-user rate; a controlled Bangladesh-minus-Philippines version yields -9.16 percentage points. HAC p-values are approximately 0.065 in both cases, while a Philippines geographic placebo is near zero. Donut specifications that omit the dates adjacent to the cutoff produce larger negative discontinuities, although their magnitude is sensitive to the exact omitted window. Consistent with Hausman and Rapson (2018), I therefore emphasize the direction and timing of the break rather than treating the RDiT p-value as the decisive inferential statistic.</w:t>
       </w:r>
     </w:p>
     <w:p>
@@ -3541,7 +3541,7 @@
         <w:rPr>
           <w:i w:val="0"/>
         </w:rPr>
-        <w:t>In the strict sample, 2,932 commits are authored during July 18-23. Of these, 829 first appear in a public push on or after July 24. The resulting author-time backlog share is 28.27 percent. Replacing the author timestamp with the committer timestamp produces a nearly identical 27.16 percent backlog share (790 of 2,909 commits). The agreement between the two metadata clocks is useful because neither timestamp is a perfect external record of when coding occurred.</w:t>
+        <w:t>In the strict sample, 2,932 commits are authored during July 18-23. Of these, 829 first appear in a public push on or after July 24. The resulting author-time backlog share is 28.27 percent. Replacing the author timestamp with the committer timestamp produces a nearly identical 27.16 percent backlog share (790 of 2,909 commits). The agreement between the two metadata clocks is useful because neither timestamp is a perfect external record of when coding occurred. Both timestamps are Git metadata generated by the author's local client or the hosting platform at commit time, not an externally verified record of the exact physical moment the code was written; the mechanism evidence is therefore consistent with offline or local work followed by delayed synchronization, but it does not directly observe the underlying production process.</w:t>
       </w:r>
     </w:p>
     <w:p>
@@ -4302,6 +4302,17 @@
         <w:rPr>
           <w:i w:val="0"/>
         </w:rPr>
+        <w:t>A related limitation concerns push-listing completeness: although 99.5-99.8 percent of pushes in every period expose a complete commit list, the share of nominal commits captured within complete pushes falls from 90.27 percent before the shutdown to 73.11 percent during the shutdown and 71.45 percent afterward. This occurs because a small number of large pushes account for a disproportionate share of commits and are more likely to have incomplete commit listings. Since the strict mechanism sample restricts to complete pushes, this does not mechanically invalidate the 28.27 percent backlog estimate, but it does imply uneven commit-level coverage across periods. The lower coverage during and after the shutdown is therefore a measurement limitation that should be considered when interpreting the mechanism results.</w:t>
+      </w:r>
+    </w:p>
+    <w:p>
+      <w:pPr>
+        <w:keepLines w:val="0"/>
+      </w:pPr>
+      <w:r>
+        <w:rPr>
+          <w:i w:val="0"/>
+        </w:rPr>
         <w:t>Location is another measurement limitation. GitHub location fields are user-entered and may be missing, stale, or imprecise. The estimates should be read as applying to accounts associated with Bangladesh and the donor countries, not as a verified census of developers physically located in each country on every date. Public-event data additionally exclude private repositories. If private and public work respond differently to a shutdown, the paper estimates the effect on the observable public margin rather than on all software production.</w:t>
       </w:r>
     </w:p>
@@ -4417,7 +4428,7 @@
         <w:rPr>
           <w:i w:val="0"/>
         </w:rPr>
-        <w:t>The commit-level evidence adds an important qualification. A substantial share of commits authored during the outage appeared only after connectivity began to return. The shutdown therefore suppressed observable online activity more strongly than it suppressed all local code creation. This distinction is central to measuring the cost of connectivity shocks in software production: an outage can both destroy contemporaneous production and shift part of the remaining production into an offline backlog.</w:t>
+        <w:t>The commit-level evidence adds an important qualification. A substantial share of commits authored during the outage appeared only after connectivity began to return. The shutdown therefore suppressed observable online activity more strongly than it suppressed all local code creation. This distinction is central to measuring the effects of connectivity shocks on observable software-development activity: an outage can reduce contemporaneous online activity while shifting part of the remaining work into an offline backlog that is synchronized later.</w:t>
       </w:r>
     </w:p>
     <w:p>
@@ -4428,7 +4439,7 @@
         <w:rPr>
           <w:i w:val="0"/>
         </w:rPr>
-        <w:t>The paper's main limitation is the coincidence of the shutdown with severe domestic unrest. Future work could combine network telemetry at subnational or provider level with developer location at finer geographic resolution, or exploit variation in restoration timing across networks and regions. Such designs could more sharply separate the direct effect of connectivity from the broader social environment. Even with this limitation, the evidence shows that modern software production is highly exposed to network availability and that public development platforms can provide unusually granular measures of that exposure.</w:t>
+        <w:t>The paper's main limitation is the coincidence of the shutdown with severe domestic unrest. Future work could combine network telemetry at subnational or provider level with developer location at finer geographic resolution, or exploit variation in restoration timing across networks and regions. Such designs could more sharply separate the direct effect of connectivity from the broader social environment. Even with this limitation, the evidence is consistent with observable software-development activity being highly exposed to network availability and with public development platforms providing unusually granular measures of that exposure.</w:t>
       </w:r>
     </w:p>
     <w:p>

</xml_diff>